<commit_message>
Hinweis nicht fachlich geprüft, Fachreviewer, neue Adresse
</commit_message>
<xml_diff>
--- a/content/mustervertraege/ch-leg-verein/mustervertrag-leg-verein.docx
+++ b/content/mustervertraege/ch-leg-verein/mustervertrag-leg-verein.docx
@@ -28,6 +28,34 @@
       </w:pPr>
       <w:r>
         <w:t xml:space="preserve">Version 1.0 · Stand 29. September 2026 · Schweiz · Lizenz CC BY 4.0 («Open Energy Archive, CC BY 4.0»)</w:t>
+      </w:r>
+    </w:p>
+    <w:p>
+      <w:pPr>
+        <w:pBdr>
+          <w:left w:val="single" w:color="0F5C4A" w:sz="18" w:space="6"/>
+        </w:pBdr>
+        <w:shd w:fill="EEF3F1" w:color="auto" w:val="clear"/>
+        <w:spacing w:after="120" w:before="60"/>
+        <w:ind w:left="120" w:right="120"/>
+      </w:pPr>
+      <w:r>
+        <w:rPr>
+          <w:b/>
+          <w:bCs/>
+          <w:color w:val="44546A"/>
+          <w:sz w:val="19"/>
+          <w:szCs w:val="19"/>
+        </w:rPr>
+        <w:t xml:space="preserve">Nicht fachlich geprüft.</w:t>
+      </w:r>
+      <w:r>
+        <w:rPr>
+          <w:color w:val="44546A"/>
+          <w:sz w:val="19"/>
+          <w:szCs w:val="19"/>
+        </w:rPr>
+        <w:t xml:space="preserve"> Dieses Muster wurde noch nicht von einer Fachperson für Energierecht geprüft. Hinweise und Korrekturen sind willkommen (GitHub Issues).</w:t>
       </w:r>
     </w:p>
     <w:p>

</xml_diff>